<commit_message>
Secure Flashing and Secure Boot Implementation
</commit_message>
<xml_diff>
--- a/Message Sequence for Bootloader Version.docx
+++ b/Message Sequence for Bootloader Version.docx
@@ -40,22 +40,13 @@
         </w:rPr>
         <w:t xml:space="preserve">Message Sequence </w:t>
       </w:r>
-      <w:proofErr w:type="spellStart"/>
       <w:proofErr w:type="gramStart"/>
       <w:r>
         <w:rPr>
           <w:b/>
           <w:bCs/>
         </w:rPr>
-        <w:t>tx</w:t>
-      </w:r>
-      <w:proofErr w:type="spellEnd"/>
-      <w:r>
-        <w:rPr>
-          <w:b/>
-          <w:bCs/>
-        </w:rPr>
-        <w:t xml:space="preserve"> :</w:t>
+        <w:t>tx :</w:t>
       </w:r>
       <w:proofErr w:type="gramEnd"/>
     </w:p>
@@ -146,21 +137,8 @@
       <w:r>
         <w:t xml:space="preserve">Command(0x81) + </w:t>
       </w:r>
-      <w:proofErr w:type="spellStart"/>
-      <w:r>
-        <w:t>Starting_Page_Address</w:t>
-      </w:r>
-      <w:proofErr w:type="spellEnd"/>
-      <w:r>
-        <w:t xml:space="preserve">(4Byte) + </w:t>
-      </w:r>
-      <w:proofErr w:type="spellStart"/>
-      <w:r>
-        <w:t>No_Of_Pages</w:t>
-      </w:r>
-      <w:proofErr w:type="spellEnd"/>
-      <w:r>
-        <w:t>(1Byte)</w:t>
+      <w:r>
+        <w:t>Identifier(2Bytes)</w:t>
       </w:r>
     </w:p>
     <w:p>
@@ -256,37 +234,116 @@
     </w:p>
     <w:p>
       <w:r>
-        <w:t>Command(0x82)</w:t>
-      </w:r>
-      <w:r>
+        <w:t>Command(0x8</w:t>
+      </w:r>
+      <w:r>
+        <w:t>3</w:t>
+      </w:r>
+      <w:r>
+        <w:t>) +</w:t>
+      </w:r>
+      <w:r>
+        <w:t xml:space="preserve"> Frame_</w:t>
+      </w:r>
+      <w:proofErr w:type="gramStart"/>
+      <w:r>
+        <w:t>No(</w:t>
+      </w:r>
+      <w:proofErr w:type="gramEnd"/>
+      <w:r>
+        <w:t xml:space="preserve">1 Bytes) + </w:t>
+      </w:r>
+      <w:proofErr w:type="gramStart"/>
+      <w:r>
+        <w:t>Data(</w:t>
+      </w:r>
+      <w:proofErr w:type="gramEnd"/>
+      <w:r>
+        <w:t>2048</w:t>
+      </w:r>
+      <w:r>
+        <w:t xml:space="preserve"> Bytes) -&gt; Untill it finishes all the frame</w:t>
+      </w:r>
+    </w:p>
+    <w:p>
+      <w:pPr>
+        <w:rPr>
+          <w:b/>
+          <w:bCs/>
+        </w:rPr>
+      </w:pPr>
+      <w:proofErr w:type="gramStart"/>
+      <w:r>
+        <w:rPr>
+          <w:b/>
+          <w:bCs/>
+        </w:rPr>
+        <w:t>Rx :</w:t>
+      </w:r>
+      <w:proofErr w:type="gramEnd"/>
+      <w:r>
+        <w:rPr>
+          <w:b/>
+          <w:bCs/>
+        </w:rPr>
         <w:t xml:space="preserve"> </w:t>
       </w:r>
-      <w:r>
-        <w:t xml:space="preserve">+ Start Address(4Bytes) + </w:t>
-      </w:r>
-      <w:proofErr w:type="spellStart"/>
-      <w:r>
-        <w:t>Total_</w:t>
+    </w:p>
+    <w:p>
+      <w:r>
+        <w:t xml:space="preserve">Command(0x83) + Frame_No(1Bytes) + </w:t>
       </w:r>
       <w:proofErr w:type="gramStart"/>
       <w:r>
-        <w:t>Size</w:t>
-      </w:r>
-      <w:proofErr w:type="spellEnd"/>
-      <w:r>
-        <w:t>(</w:t>
+        <w:t>Result(</w:t>
       </w:r>
       <w:proofErr w:type="gramEnd"/>
       <w:r>
-        <w:t xml:space="preserve">2 </w:t>
+        <w:t>Writing)</w:t>
+      </w:r>
+    </w:p>
+    <w:p/>
+    <w:p>
+      <w:pPr>
+        <w:rPr>
+          <w:b/>
+          <w:bCs/>
+        </w:rPr>
+      </w:pPr>
+      <w:r>
+        <w:rPr>
+          <w:b/>
+          <w:bCs/>
+        </w:rPr>
+        <w:t>Message Sequence Signature Verification:</w:t>
+      </w:r>
+    </w:p>
+    <w:p>
+      <w:pPr>
+        <w:rPr>
+          <w:b/>
+          <w:bCs/>
+        </w:rPr>
+      </w:pPr>
+      <w:r>
+        <w:rPr>
+          <w:b/>
+          <w:bCs/>
+        </w:rPr>
+        <w:t>Tx:</w:t>
+      </w:r>
+    </w:p>
+    <w:p>
+      <w:r>
+        <w:t xml:space="preserve">Command (0x84) + </w:t>
       </w:r>
       <w:proofErr w:type="gramStart"/>
       <w:r>
-        <w:t>bytes)  -</w:t>
+        <w:t>Signature(</w:t>
       </w:r>
       <w:proofErr w:type="gramEnd"/>
       <w:r>
-        <w:t xml:space="preserve"> Send the info of Address and Size</w:t>
+        <w:t>64 Bytes)</w:t>
       </w:r>
     </w:p>
     <w:p>
@@ -301,117 +358,29 @@
           <w:b/>
           <w:bCs/>
         </w:rPr>
-        <w:t xml:space="preserve">Rx: </w:t>
-      </w:r>
-    </w:p>
-    <w:p>
-      <w:r>
-        <w:t>Command</w:t>
-      </w:r>
-      <w:r>
-        <w:t>(0x82</w:t>
+        <w:t>Rx:</w:t>
+      </w:r>
+    </w:p>
+    <w:p>
+      <w:r>
+        <w:t>Command(0x84) + Verification_</w:t>
       </w:r>
       <w:proofErr w:type="gramStart"/>
       <w:r>
-        <w:t xml:space="preserve">) </w:t>
-      </w:r>
-      <w:r>
-        <w:t xml:space="preserve"> </w:t>
-      </w:r>
-      <w:r>
-        <w:t>+</w:t>
+        <w:t>Result(</w:t>
       </w:r>
       <w:proofErr w:type="gramEnd"/>
       <w:r>
-        <w:t xml:space="preserve"> ACK(1Bytes) – Response to prepare download message</w:t>
-      </w:r>
-    </w:p>
-    <w:p>
-      <w:proofErr w:type="gramStart"/>
-      <w:r>
-        <w:t>Tx :</w:t>
-      </w:r>
-      <w:proofErr w:type="gramEnd"/>
-    </w:p>
-    <w:p>
-      <w:r>
-        <w:t>Command(0x8</w:t>
-      </w:r>
-      <w:r>
-        <w:t>3</w:t>
-      </w:r>
-      <w:r>
-        <w:t>) +</w:t>
-      </w:r>
-      <w:r>
-        <w:t xml:space="preserve"> </w:t>
-      </w:r>
-      <w:proofErr w:type="spellStart"/>
-      <w:r>
-        <w:t>Frame_</w:t>
-      </w:r>
-      <w:proofErr w:type="gramStart"/>
-      <w:r>
-        <w:t>No</w:t>
-      </w:r>
-      <w:proofErr w:type="spellEnd"/>
-      <w:r>
-        <w:t>(</w:t>
-      </w:r>
-      <w:proofErr w:type="gramEnd"/>
-      <w:r>
-        <w:t xml:space="preserve">1 Bytes) + </w:t>
-      </w:r>
-      <w:proofErr w:type="gramStart"/>
-      <w:r>
-        <w:t>Data(</w:t>
-      </w:r>
-      <w:proofErr w:type="gramEnd"/>
-      <w:r>
-        <w:t>2048</w:t>
-      </w:r>
-      <w:r>
-        <w:t xml:space="preserve"> Bytes) -&gt; </w:t>
-      </w:r>
-      <w:proofErr w:type="spellStart"/>
-      <w:r>
-        <w:t>Untill</w:t>
-      </w:r>
-      <w:proofErr w:type="spellEnd"/>
-      <w:r>
-        <w:t xml:space="preserve"> it finishes all the frame</w:t>
-      </w:r>
-    </w:p>
-    <w:p>
-      <w:proofErr w:type="gramStart"/>
-      <w:r>
-        <w:t>Rx :</w:t>
-      </w:r>
-      <w:proofErr w:type="gramEnd"/>
-      <w:r>
-        <w:t xml:space="preserve"> </w:t>
-      </w:r>
-    </w:p>
-    <w:p>
-      <w:r>
-        <w:t xml:space="preserve">Command(0x83) + </w:t>
-      </w:r>
-      <w:proofErr w:type="spellStart"/>
-      <w:r>
-        <w:t>Frame_No</w:t>
-      </w:r>
-      <w:proofErr w:type="spellEnd"/>
-      <w:r>
-        <w:t xml:space="preserve">(1Bytes) + </w:t>
-      </w:r>
-      <w:proofErr w:type="gramStart"/>
-      <w:r>
-        <w:t>Result(</w:t>
-      </w:r>
-      <w:proofErr w:type="gramEnd"/>
-      <w:r>
-        <w:t>Writing)</w:t>
-      </w:r>
+        <w:t>0 or 1)</w:t>
+      </w:r>
+    </w:p>
+    <w:p>
+      <w:pPr>
+        <w:rPr>
+          <w:b/>
+          <w:bCs/>
+        </w:rPr>
+      </w:pPr>
     </w:p>
     <w:p>
       <w:r>

</xml_diff>